<commit_message>
Check In 2 updated
Fixed wording of Check In 2 and exported to pdf
</commit_message>
<xml_diff>
--- a/Documentation/Weekly Check In/Weekly Check In Docx/Team04_CheckIn_Week02.docx
+++ b/Documentation/Weekly Check In/Weekly Check In Docx/Team04_CheckIn_Week02.docx
@@ -309,18 +309,22 @@
           <w:rFonts w:ascii="Times New Roman" w:hAnsi="Times New Roman" w:cs="Times New Roman"/>
         </w:rPr>
         <w:tab/>
-        <w:t xml:space="preserve">This week we finalized our project to be the Resilient and Secure Network Server, further discussing our team strengths and weaknesses. Additionally, we got added to our team Github which allowed us to upload and sign our team contract, finalizing it. </w:t>
-      </w:r>
-    </w:p>
-    <w:p>
-      <w:pPr>
-        <w:rPr>
-          <w:rFonts w:ascii="Times New Roman" w:hAnsi="Times New Roman" w:cs="Times New Roman"/>
-          <w:sz w:val="28"/>
-          <w:szCs w:val="28"/>
-          <w:u w:val="single"/>
-        </w:rPr>
-      </w:pPr>
+        <w:t xml:space="preserve">This week we finalized our project to be the Resilient and Secure Network Server, further discussing our team strengths and weaknesses. Additionally, we got added to our team </w:t>
+      </w:r>
+      <w:proofErr w:type="spellStart"/>
+      <w:r>
+        <w:rPr>
+          <w:rFonts w:ascii="Times New Roman" w:hAnsi="Times New Roman" w:cs="Times New Roman"/>
+        </w:rPr>
+        <w:t>Github</w:t>
+      </w:r>
+      <w:proofErr w:type="spellEnd"/>
+      <w:r>
+        <w:rPr>
+          <w:rFonts w:ascii="Times New Roman" w:hAnsi="Times New Roman" w:cs="Times New Roman"/>
+        </w:rPr>
+        <w:t xml:space="preserve"> which allowed us to upload and sign our team contract, finalizing it. </w:t>
+      </w:r>
     </w:p>
     <w:p>
       <w:pPr>
@@ -688,16 +692,59 @@
           <w:u w:val="single"/>
         </w:rPr>
       </w:pPr>
-    </w:p>
-    <w:p>
-      <w:pPr>
+      <w:r>
         <w:rPr>
           <w:rFonts w:ascii="Times New Roman" w:hAnsi="Times New Roman" w:cs="Times New Roman"/>
           <w:sz w:val="28"/>
           <w:szCs w:val="28"/>
           <w:u w:val="single"/>
         </w:rPr>
-      </w:pPr>
+        <w:t>Plan for Next Week</w:t>
+      </w:r>
+    </w:p>
+    <w:p>
+      <w:pPr>
+        <w:rPr>
+          <w:rFonts w:ascii="Times New Roman" w:hAnsi="Times New Roman" w:cs="Times New Roman"/>
+        </w:rPr>
+      </w:pPr>
+      <w:r>
+        <w:rPr>
+          <w:rFonts w:ascii="Times New Roman" w:hAnsi="Times New Roman" w:cs="Times New Roman"/>
+        </w:rPr>
+        <w:tab/>
+        <w:t xml:space="preserve">Next week, we plan to meet with our </w:t>
+      </w:r>
+      <w:r>
+        <w:rPr>
+          <w:rFonts w:ascii="Times New Roman" w:hAnsi="Times New Roman" w:cs="Times New Roman"/>
+        </w:rPr>
+        <w:t>Sponsor</w:t>
+      </w:r>
+      <w:r>
+        <w:rPr>
+          <w:rFonts w:ascii="Times New Roman" w:hAnsi="Times New Roman" w:cs="Times New Roman"/>
+        </w:rPr>
+        <w:t>, Dr. Aust</w:t>
+      </w:r>
+      <w:r>
+        <w:rPr>
+          <w:rFonts w:ascii="Times New Roman" w:hAnsi="Times New Roman" w:cs="Times New Roman"/>
+        </w:rPr>
+        <w:t>e</w:t>
+      </w:r>
+      <w:r>
+        <w:rPr>
+          <w:rFonts w:ascii="Times New Roman" w:hAnsi="Times New Roman" w:cs="Times New Roman"/>
+        </w:rPr>
+        <w:t>n</w:t>
+      </w:r>
+      <w:r>
+        <w:rPr>
+          <w:rFonts w:ascii="Times New Roman" w:hAnsi="Times New Roman" w:cs="Times New Roman"/>
+        </w:rPr>
+        <w:t>, to get more details about this project so we can better distribute work and create a plan for this and next semester.</w:t>
+      </w:r>
     </w:p>
     <w:p>
       <w:pPr>
@@ -708,86 +755,6 @@
           <w:u w:val="single"/>
         </w:rPr>
       </w:pPr>
-      <w:r>
-        <w:rPr>
-          <w:rFonts w:ascii="Times New Roman" w:hAnsi="Times New Roman" w:cs="Times New Roman"/>
-          <w:sz w:val="28"/>
-          <w:szCs w:val="28"/>
-          <w:u w:val="single"/>
-        </w:rPr>
-        <w:t>Plan for Next Week</w:t>
-      </w:r>
-    </w:p>
-    <w:p>
-      <w:pPr>
-        <w:rPr>
-          <w:rFonts w:ascii="Times New Roman" w:hAnsi="Times New Roman" w:cs="Times New Roman"/>
-        </w:rPr>
-      </w:pPr>
-      <w:r>
-        <w:rPr>
-          <w:rFonts w:ascii="Times New Roman" w:hAnsi="Times New Roman" w:cs="Times New Roman"/>
-        </w:rPr>
-        <w:tab/>
-        <w:t>Next week, we plan to meet with our advisor, Dr. Aust</w:t>
-      </w:r>
-      <w:r>
-        <w:rPr>
-          <w:rFonts w:ascii="Times New Roman" w:hAnsi="Times New Roman" w:cs="Times New Roman"/>
-        </w:rPr>
-        <w:t>e</w:t>
-      </w:r>
-      <w:r>
-        <w:rPr>
-          <w:rFonts w:ascii="Times New Roman" w:hAnsi="Times New Roman" w:cs="Times New Roman"/>
-        </w:rPr>
-        <w:t>n</w:t>
-      </w:r>
-      <w:r>
-        <w:rPr>
-          <w:rFonts w:ascii="Times New Roman" w:hAnsi="Times New Roman" w:cs="Times New Roman"/>
-        </w:rPr>
-        <w:t>, to get more details about this project so we can better distribute work and create a plan for this and next semester.</w:t>
-      </w:r>
-    </w:p>
-    <w:p>
-      <w:pPr>
-        <w:rPr>
-          <w:rFonts w:ascii="Times New Roman" w:hAnsi="Times New Roman" w:cs="Times New Roman"/>
-          <w:sz w:val="28"/>
-          <w:szCs w:val="28"/>
-          <w:u w:val="single"/>
-        </w:rPr>
-      </w:pPr>
-    </w:p>
-    <w:p>
-      <w:pPr>
-        <w:rPr>
-          <w:rFonts w:ascii="Times New Roman" w:hAnsi="Times New Roman" w:cs="Times New Roman"/>
-          <w:sz w:val="28"/>
-          <w:szCs w:val="28"/>
-          <w:u w:val="single"/>
-        </w:rPr>
-      </w:pPr>
-    </w:p>
-    <w:p>
-      <w:pPr>
-        <w:rPr>
-          <w:rFonts w:ascii="Times New Roman" w:hAnsi="Times New Roman" w:cs="Times New Roman"/>
-          <w:sz w:val="28"/>
-          <w:szCs w:val="28"/>
-          <w:u w:val="single"/>
-        </w:rPr>
-      </w:pPr>
-      <w:r>
-        <w:rPr>
-          <w:rFonts w:ascii="Times New Roman" w:hAnsi="Times New Roman" w:cs="Times New Roman"/>
-          <w:sz w:val="28"/>
-          <w:szCs w:val="28"/>
-          <w:u w:val="single"/>
-        </w:rPr>
-        <w:t>Help Needed From Instructor/Sponsor</w:t>
-      </w:r>
     </w:p>
     <w:sectPr>
       <w:headerReference w:type="default" r:id="rId7"/>

</xml_diff>